<commit_message>
Sadie: summary v2 (uncapped rewrite), bullet 1 back to library wording
Co-Authored-By: Claude Opus 5.5 <noreply@anthropic.com>
Claude-Session: https://claude.ai/code/session_014835d5zvmZyLhAC8KJFCFv
</commit_message>
<xml_diff>
--- a/jobs/2026-09-29 Sadie/Kfir_Braunstein_PM_Sadie.docx
+++ b/jobs/2026-09-29 Sadie/Kfir_Braunstein_PM_Sadie.docx
@@ -72,7 +72,7 @@
           <w:color w:val="1a1a1a"/>
           <w:rtl w:val="0"/>
         </w:rPr>
-        <w:t>Product Manager with 5 years of experience in product and customer success roles at a B2B2C SaaS company serving 100+ municipalities and organizations across North America and Europe, engaging 12M+ residents. Started as a CSM owning about $2M ARR in client contracts, then was promoted to the company's first Product Manager, owning the platform from discovery to launch with Design and Engineering. As the sole PM, ran sprint planning, backlog grooming, and acceptance criteria, and led requirements sessions and roadmap reviews with clients.</w:t>
+        <w:t>Product Manager with 5 years of experience in product and customer success roles at a B2B2C SaaS company serving 100+ municipalities and organizations across North America and Europe, engaging 12M+ residents. Started in Customer Success owning about $2M ARR in client contracts, then was promoted to the company's first Product Manager, the only PM, working with Design and Engineering from discovery to release. Ran sprint planning and backlog grooming, and wrote the user stories and acceptance criteria Engineering built from, starting from what clients and CS reported.</w:t>
       </w:r>
       <w:r>
         <w:rPr>
@@ -216,7 +216,7 @@
           <w:vertAlign w:val="baseline"/>
           <w:rtl w:val="0"/>
         </w:rPr>
-        <w:t>Led a new subscription and multi-entry payment product from discovery to launch, turning messy client and Sales requests into clear requirements and acceptance criteria and shipping with Engineering to generate $100K+ in incremental ARR.</w:t>
+        <w:t>Led a new subscription and multi-entry payment product from discovery to launch, turning messy client and Sales requests into clear requirements and shipping with Engineering to generate $100K+ in incremental ARR.</w:t>
       </w:r>
       <w:r>
         <w:rPr>

</xml_diff>